<commit_message>
feat: add China community sync and admin console
</commit_message>
<xml_diff>
--- a/docs/strategies/CN-China-address-generation-and-key-rotation.docx
+++ b/docs/strategies/CN-China-address-generation-and-key-rotation.docx
@@ -288,7 +288,7 @@
                 <w:rFonts w:ascii="Calibri" w:hAnsi="Calibri" w:eastAsia="Microsoft YaHei"/>
                 <w:sz w:val="18"/>
               </w:rPr>
-              <w:t>实施前设计基线</w:t>
+              <w:t>已实现基线（待生产数据同步）</w:t>
             </w:r>
           </w:p>
         </w:tc>
@@ -472,9 +472,7 @@
         </w:rPr>
         <w:t>Address Project</w:t>
       </w:r>
-      <w:r>
-        <w:br w:type="page"/>
-      </w:r>
+      <w:r/>
     </w:p>
     <w:p>
       <w:pPr>
@@ -522,7 +520,7 @@
           <w:rFonts w:ascii="Calibri" w:hAnsi="Calibri" w:eastAsia="Microsoft YaHei"/>
           <w:i w:val="0"/>
         </w:rPr>
-        <w:t>当前代码中的中国虚构小区词库和 OSM 小区侧车数据将退出中国生成链路。真实小区名、POI 坐标和地图登记地址由高德、腾讯、百度提供；省、市、区县标准名称及三级边界由 AreaCity 提供。</w:t>
+        <w:t>中国虚构小区词库和 OSM 小区侧车数据已退出中国生成链路。真实小区名、POI 坐标和地图登记地址由高德、腾讯、百度提供；省、市、区县标准名称由 AreaCity 提供。</w:t>
       </w:r>
     </w:p>
     <w:p>
@@ -1096,7 +1094,7 @@
         <w:keepNext/>
       </w:pPr>
       <w:r>
-        <w:t>2. 当前系统与问题基线</w:t>
+        <w:t>2. 当前系统与实现基线</w:t>
       </w:r>
     </w:p>
     <w:p>
@@ -1105,7 +1103,7 @@
           <w:rFonts w:ascii="Calibri" w:hAnsi="Calibri" w:eastAsia="Microsoft YaHei"/>
           <w:i w:val="0"/>
         </w:rPr>
-        <w:t>当前项目采用 Astro + React 前端、Hono API、SQLite 地址池和独立同步控制服务。已有 /admin 页面只支持输入同步令牌、启动分片同步和查询任务状态，尚未形成完整的配置、身份认证、Key 管理和数据质量体系。</w:t>
+        <w:t>当前项目采用 Astro + React 前端、Hono API、SQLite 地址池和独立 control.sqlite。管理后台已实现管理员会话、访问设置、地图 Key 池、中国同步、API Token、任务、审计和系统信息。</w:t>
       </w:r>
     </w:p>
     <w:tbl>
@@ -1177,7 +1175,7 @@
                 <w:color w:val="0B2545"/>
                 <w:sz w:val="19"/>
               </w:rPr>
-              <w:t>现状</w:t>
+              <w:t>实现状态</w:t>
             </w:r>
           </w:p>
         </w:tc>
@@ -1204,7 +1202,7 @@
                 <w:color w:val="0B2545"/>
                 <w:sz w:val="19"/>
               </w:rPr>
-              <w:t>目标调整</w:t>
+              <w:t>当前设计</w:t>
             </w:r>
           </w:p>
         </w:tc>
@@ -1257,7 +1255,7 @@
                 <w:rFonts w:ascii="Calibri" w:hAnsi="Calibri" w:eastAsia="Microsoft YaHei"/>
                 <w:sz w:val="18"/>
               </w:rPr>
-              <w:t>中国小区存在内置虚构词库兜底</w:t>
+              <w:t>已移除中国虚构小区兜底</w:t>
             </w:r>
           </w:p>
         </w:tc>
@@ -1281,7 +1279,7 @@
                 <w:rFonts w:ascii="Calibri" w:hAnsi="Calibri" w:eastAsia="Microsoft YaHei"/>
                 <w:sz w:val="18"/>
               </w:rPr>
-              <w:t>删除中国虚构小区兜底；只选择数据库中的真实小区</w:t>
+              <w:t>只选择 cn_communities_v2 中的真实小区</w:t>
             </w:r>
           </w:p>
         </w:tc>
@@ -1334,7 +1332,7 @@
                 <w:rFonts w:ascii="Calibri" w:hAnsi="Calibri" w:eastAsia="Microsoft YaHei"/>
                 <w:sz w:val="18"/>
               </w:rPr>
-              <w:t>cn_communities 来源为 OSM residential/neighbourhood</w:t>
+              <w:t>已停止 OSM 小区侧车导入</w:t>
             </w:r>
           </w:p>
         </w:tc>
@@ -1358,7 +1356,7 @@
                 <w:rFonts w:ascii="Calibri" w:hAnsi="Calibri" w:eastAsia="Microsoft YaHei"/>
                 <w:sz w:val="18"/>
               </w:rPr>
-              <w:t>换成地图 POI 同步器和多来源证据表</w:t>
+              <w:t>地图 POI 使用独立同步器和多来源证据表</w:t>
             </w:r>
           </w:p>
         </w:tc>
@@ -1411,7 +1409,7 @@
                 <w:rFonts w:ascii="Calibri" w:hAnsi="Calibri" w:eastAsia="Microsoft YaHei"/>
                 <w:sz w:val="18"/>
               </w:rPr>
-              <w:t>中国仍属于 Geofabrik 地址分片</w:t>
+              <w:t>中国分片仅保留门牌地址同步</w:t>
             </w:r>
           </w:p>
         </w:tc>
@@ -1435,7 +1433,7 @@
                 <w:rFonts w:ascii="Calibri" w:hAnsi="Calibri" w:eastAsia="Microsoft YaHei"/>
                 <w:sz w:val="18"/>
               </w:rPr>
-              <w:t>中国小区改走独立 CN 同步计划</w:t>
+              <w:t>中国小区使用独立 CN 同步计划</w:t>
             </w:r>
           </w:p>
         </w:tc>
@@ -1488,7 +1486,7 @@
                 <w:rFonts w:ascii="Calibri" w:hAnsi="Calibri" w:eastAsia="Microsoft YaHei"/>
                 <w:sz w:val="18"/>
               </w:rPr>
-              <w:t>浏览器临时输入单一管理令牌</w:t>
+              <w:t>已实现管理员登录、会话与设置中心</w:t>
             </w:r>
           </w:p>
         </w:tc>
@@ -1512,7 +1510,7 @@
                 <w:rFonts w:ascii="Calibri" w:hAnsi="Calibri" w:eastAsia="Microsoft YaHei"/>
                 <w:sz w:val="18"/>
               </w:rPr>
-              <w:t>完整管理员登录、会话和设置中心</w:t>
+              <w:t>管理认证、Key、同步、Token、任务与审计</w:t>
             </w:r>
           </w:p>
         </w:tc>
@@ -1565,7 +1563,7 @@
                 <w:rFonts w:ascii="Calibri" w:hAnsi="Calibri" w:eastAsia="Microsoft YaHei"/>
                 <w:sz w:val="18"/>
               </w:rPr>
-              <w:t>地图凭据主要来自单值环境变量</w:t>
+              <w:t>地图凭据来自加密 Key 池</w:t>
             </w:r>
           </w:p>
         </w:tc>
@@ -1589,7 +1587,7 @@
                 <w:rFonts w:ascii="Calibri" w:hAnsi="Calibri" w:eastAsia="Microsoft YaHei"/>
                 <w:sz w:val="18"/>
               </w:rPr>
-              <w:t>改为加密 Key 池；环境变量只保留主加密密钥</w:t>
+              <w:t>环境变量只保留主加密密钥</w:t>
             </w:r>
           </w:p>
         </w:tc>
@@ -2675,7 +2673,7 @@
           <w:rFonts w:ascii="Calibri" w:hAnsi="Calibri" w:eastAsia="Microsoft YaHei"/>
           <w:i w:val="0"/>
         </w:rPr>
-        <w:t>同一个规范小区只保留一条 cn_communities 主记录，每个平台的原始 POI 信息保存在 cn_community_sources。来源记录保存 provider、provider_poi_id、名称、分类、地址、adcode、原始坐标和观察时间。</w:t>
+        <w:t>同一个规范小区只保留一条 cn_communities_v2 主记录，每个平台的原始 POI 信息保存在 cn_community_sources。来源记录保存 provider、provider_poi_id、名称、分类、地址、adcode、原始坐标和观察时间。</w:t>
       </w:r>
     </w:p>
     <w:tbl>
@@ -5938,7 +5936,7 @@
                 <w:rFonts w:ascii="Calibri" w:hAnsi="Calibri" w:eastAsia="Microsoft YaHei"/>
                 <w:sz w:val="18"/>
               </w:rPr>
-              <w:t>cn_communities</w:t>
+              <w:t>cn_communities_v2</w:t>
             </w:r>
           </w:p>
         </w:tc>
@@ -6403,7 +6401,7 @@
         <w:keepNext/>
       </w:pPr>
       <w:r>
-        <w:t>7.1 cn_communities 核心字段</w:t>
+        <w:t>7.1 cn_communities_v2 核心字段</w:t>
       </w:r>
     </w:p>
     <w:p>

</xml_diff>